<commit_message>
Add dashboard screenshots and update guidance note
Add six dashboard screenshot images under Guidance note/Dashboard screenshots and add a pre-screenshots draft document (Guidance Note on Producing Poverty Maps (pre-screenshots).docx). Also update the main Guidance Note on Producing Poverty Maps.docx (binary content changed). These files provide visual assets and an updated guidance document for producing poverty maps.
</commit_message>
<xml_diff>
--- a/Guidance note/Guidance Note on Producing Poverty Maps.docx
+++ b/Guidance note/Guidance Note on Producing Poverty Maps.docx
@@ -25374,6 +25374,57 @@
     </w:p>
     <w:p>
       <w:pPr>
+        <w:pStyle w:val="CaptionedFigure"/>
+        <w:keepNext/>
+        <w:jc w:val="center"/>
+      </w:pPr>
+      <w:r>
+        <w:drawing>
+          <wp:inline xmlns:a="http://schemas.openxmlformats.org/drawingml/2006/main" xmlns:pic="http://schemas.openxmlformats.org/drawingml/2006/picture">
+            <wp:extent cx="5486400" cy="3429000"/>
+            <wp:docPr id="1928386426" name="Picture 1928386426"/>
+            <wp:cNvGraphicFramePr>
+              <a:graphicFrameLocks noChangeAspect="1"/>
+            </wp:cNvGraphicFramePr>
+            <a:graphic>
+              <a:graphicData uri="http://schemas.openxmlformats.org/drawingml/2006/picture">
+                <pic:pic>
+                  <pic:nvPicPr>
+                    <pic:cNvPr id="0" name="01_launch.png"/>
+                    <pic:cNvPicPr/>
+                  </pic:nvPicPr>
+                  <pic:blipFill>
+                    <a:blip r:embed="rId24"/>
+                    <a:stretch>
+                      <a:fillRect/>
+                    </a:stretch>
+                  </pic:blipFill>
+                  <pic:spPr>
+                    <a:xfrm>
+                      <a:off x="0" y="0"/>
+                      <a:ext cx="5486400" cy="3429000"/>
+                    </a:xfrm>
+                    <a:prstGeom prst="rect"/>
+                  </pic:spPr>
+                </pic:pic>
+              </a:graphicData>
+            </a:graphic>
+          </wp:inline>
+        </w:drawing>
+      </w:r>
+    </w:p>
+    <w:p>
+      <w:pPr>
+        <w:pStyle w:val="ImageCaption"/>
+        <w:keepLines/>
+        <w:jc w:val="center"/>
+      </w:pPr>
+      <w:r>
+        <w:t>Figure 10. The EU SAE Dashboard landing screen; Get Started opens the in-app guide and main workspace. Produced by the EU SAE Dashboard.</w:t>
+      </w:r>
+    </w:p>
+    <w:p>
+      <w:pPr>
         <w:pStyle w:val="Heading2"/>
       </w:pPr>
       <w:bookmarkStart w:id="220" w:name="app-workflow"/>
@@ -25452,6 +25503,57 @@
       </w:r>
       <w:r>
         <w:t>, run in sequence.</w:t>
+      </w:r>
+    </w:p>
+    <w:p>
+      <w:pPr>
+        <w:pStyle w:val="CaptionedFigure"/>
+        <w:keepNext/>
+        <w:jc w:val="center"/>
+      </w:pPr>
+      <w:r>
+        <w:drawing>
+          <wp:inline xmlns:a="http://schemas.openxmlformats.org/drawingml/2006/main" xmlns:pic="http://schemas.openxmlformats.org/drawingml/2006/picture">
+            <wp:extent cx="5486400" cy="3429000"/>
+            <wp:docPr id="1928386425" name="Picture 1928386425"/>
+            <wp:cNvGraphicFramePr>
+              <a:graphicFrameLocks noChangeAspect="1"/>
+            </wp:cNvGraphicFramePr>
+            <a:graphic>
+              <a:graphicData uri="http://schemas.openxmlformats.org/drawingml/2006/picture">
+                <pic:pic>
+                  <pic:nvPicPr>
+                    <pic:cNvPr id="0" name="02_workspace.png"/>
+                    <pic:cNvPicPr/>
+                  </pic:nvPicPr>
+                  <pic:blipFill>
+                    <a:blip r:embed="rId23"/>
+                    <a:stretch>
+                      <a:fillRect/>
+                    </a:stretch>
+                  </pic:blipFill>
+                  <pic:spPr>
+                    <a:xfrm>
+                      <a:off x="0" y="0"/>
+                      <a:ext cx="5486400" cy="3429000"/>
+                    </a:xfrm>
+                    <a:prstGeom prst="rect"/>
+                  </pic:spPr>
+                </pic:pic>
+              </a:graphicData>
+            </a:graphic>
+          </wp:inline>
+        </w:drawing>
+      </w:r>
+    </w:p>
+    <w:p>
+      <w:pPr>
+        <w:pStyle w:val="ImageCaption"/>
+        <w:keepLines/>
+        <w:jc w:val="center"/>
+      </w:pPr>
+      <w:r>
+        <w:t>Figure 11. The main workspace: analysis settings and optional data uploads in the sidebar, with Preflight, Data Readiness, and Status tabs on the right. Produced by the EU SAE Dashboard.</w:t>
       </w:r>
     </w:p>
     <w:p>
@@ -25511,7 +25613,7 @@
         <w:pStyle w:val="ImageCaption"/>
       </w:pPr>
       <w:r>
-        <w:t>Figure 10. The EU SAE Dashboard pipeline and two-step run flow.</w:t>
+        <w:t>Figure 12. The EU SAE Dashboard pipeline and two-step run flow.</w:t>
       </w:r>
     </w:p>
     <w:p>
@@ -25686,6 +25788,57 @@
       </w:r>
       <w:r>
         <w:t>. This mapping step is what lets the same application work with data from any country and any naming convention; it is also where most user errors are caught early, because a column assigned to the wrong role usually shows up immediately in the readiness check.</w:t>
+      </w:r>
+    </w:p>
+    <w:p>
+      <w:pPr>
+        <w:pStyle w:val="CaptionedFigure"/>
+        <w:keepNext/>
+        <w:jc w:val="center"/>
+      </w:pPr>
+      <w:r>
+        <w:drawing>
+          <wp:inline xmlns:a="http://schemas.openxmlformats.org/drawingml/2006/main" xmlns:pic="http://schemas.openxmlformats.org/drawingml/2006/picture">
+            <wp:extent cx="5486400" cy="3429000"/>
+            <wp:docPr id="1928386424" name="Picture 1928386424"/>
+            <wp:cNvGraphicFramePr>
+              <a:graphicFrameLocks noChangeAspect="1"/>
+            </wp:cNvGraphicFramePr>
+            <a:graphic>
+              <a:graphicData uri="http://schemas.openxmlformats.org/drawingml/2006/picture">
+                <pic:pic>
+                  <pic:nvPicPr>
+                    <pic:cNvPr id="0" name="03_inputs_mapping.png"/>
+                    <pic:cNvPicPr/>
+                  </pic:nvPicPr>
+                  <pic:blipFill>
+                    <a:blip r:embed="rId22"/>
+                    <a:stretch>
+                      <a:fillRect/>
+                    </a:stretch>
+                  </pic:blipFill>
+                  <pic:spPr>
+                    <a:xfrm>
+                      <a:off x="0" y="0"/>
+                      <a:ext cx="5486400" cy="3429000"/>
+                    </a:xfrm>
+                    <a:prstGeom prst="rect"/>
+                  </pic:spPr>
+                </pic:pic>
+              </a:graphicData>
+            </a:graphic>
+          </wp:inline>
+        </w:drawing>
+      </w:r>
+    </w:p>
+    <w:p>
+      <w:pPr>
+        <w:pStyle w:val="ImageCaption"/>
+        <w:keepLines/>
+        <w:jc w:val="center"/>
+      </w:pPr>
+      <w:r>
+        <w:t>Figure 13. Variable mapping: assigning survey columns to their roles (year, domain, PSU, weight, welfare, poverty line, and auxiliary fields). Produced by the EU SAE Dashboard.</w:t>
       </w:r>
     </w:p>
     <w:p>
@@ -26144,6 +26297,57 @@
     </w:p>
     <w:p>
       <w:pPr>
+        <w:pStyle w:val="CaptionedFigure"/>
+        <w:keepNext/>
+        <w:jc w:val="center"/>
+      </w:pPr>
+      <w:r>
+        <w:drawing>
+          <wp:inline xmlns:a="http://schemas.openxmlformats.org/drawingml/2006/main" xmlns:pic="http://schemas.openxmlformats.org/drawingml/2006/picture">
+            <wp:extent cx="5486400" cy="3429000"/>
+            <wp:docPr id="1928386423" name="Picture 1928386423"/>
+            <wp:cNvGraphicFramePr>
+              <a:graphicFrameLocks noChangeAspect="1"/>
+            </wp:cNvGraphicFramePr>
+            <a:graphic>
+              <a:graphicData uri="http://schemas.openxmlformats.org/drawingml/2006/picture">
+                <pic:pic>
+                  <pic:nvPicPr>
+                    <pic:cNvPr id="0" name="04_model_settings.png"/>
+                    <pic:cNvPicPr/>
+                  </pic:nvPicPr>
+                  <pic:blipFill>
+                    <a:blip r:embed="rId21"/>
+                    <a:stretch>
+                      <a:fillRect/>
+                    </a:stretch>
+                  </pic:blipFill>
+                  <pic:spPr>
+                    <a:xfrm>
+                      <a:off x="0" y="0"/>
+                      <a:ext cx="5486400" cy="3429000"/>
+                    </a:xfrm>
+                    <a:prstGeom prst="rect"/>
+                  </pic:spPr>
+                </pic:pic>
+              </a:graphicData>
+            </a:graphic>
+          </wp:inline>
+        </w:drawing>
+      </w:r>
+    </w:p>
+    <w:p>
+      <w:pPr>
+        <w:pStyle w:val="ImageCaption"/>
+        <w:keepLines/>
+        <w:jc w:val="center"/>
+      </w:pPr>
+      <w:r>
+        <w:t>Figure 14. Model settings: UFH transformation, bias-correction and model-selection controls, plus MFH variance, covariance, diagnostic-model, and candidate-covariate controls. Produced by the EU SAE Dashboard.</w:t>
+      </w:r>
+    </w:p>
+    <w:p>
+      <w:pPr>
         <w:pStyle w:val="Heading2"/>
       </w:pPr>
       <w:bookmarkStart w:id="236" w:name="data-readiness-check"/>
@@ -26235,6 +26439,57 @@
     </w:p>
     <w:p>
       <w:pPr>
+        <w:pStyle w:val="CaptionedFigure"/>
+        <w:keepNext/>
+        <w:jc w:val="center"/>
+      </w:pPr>
+      <w:r>
+        <w:drawing>
+          <wp:inline xmlns:a="http://schemas.openxmlformats.org/drawingml/2006/main" xmlns:pic="http://schemas.openxmlformats.org/drawingml/2006/picture">
+            <wp:extent cx="5486400" cy="3429000"/>
+            <wp:docPr id="1928386422" name="Picture 1928386422"/>
+            <wp:cNvGraphicFramePr>
+              <a:graphicFrameLocks noChangeAspect="1"/>
+            </wp:cNvGraphicFramePr>
+            <a:graphic>
+              <a:graphicData uri="http://schemas.openxmlformats.org/drawingml/2006/picture">
+                <pic:pic>
+                  <pic:nvPicPr>
+                    <pic:cNvPr id="0" name="05_data_readiness.png"/>
+                    <pic:cNvPicPr/>
+                  </pic:nvPicPr>
+                  <pic:blipFill>
+                    <a:blip r:embed="rId20"/>
+                    <a:stretch>
+                      <a:fillRect/>
+                    </a:stretch>
+                  </pic:blipFill>
+                  <pic:spPr>
+                    <a:xfrm>
+                      <a:off x="0" y="0"/>
+                      <a:ext cx="5486400" cy="3429000"/>
+                    </a:xfrm>
+                    <a:prstGeom prst="rect"/>
+                  </pic:spPr>
+                </pic:pic>
+              </a:graphicData>
+            </a:graphic>
+          </wp:inline>
+        </w:drawing>
+      </w:r>
+    </w:p>
+    <w:p>
+      <w:pPr>
+        <w:pStyle w:val="ImageCaption"/>
+        <w:keepLines/>
+        <w:jc w:val="center"/>
+      </w:pPr>
+      <w:r>
+        <w:t>Figure 15. The mandatory Data Readiness check: year consistency, domain consistency, missing rates, auxiliary-covariate summaries, and national poverty rates. Produced by the EU SAE Dashboard.</w:t>
+      </w:r>
+    </w:p>
+    <w:p>
+      <w:pPr>
         <w:pStyle w:val="Heading2"/>
       </w:pPr>
       <w:bookmarkStart w:id="238" w:name="running-the-analysis"/>
@@ -26396,6 +26651,57 @@
     </w:p>
     <w:p>
       <w:pPr>
+        <w:pStyle w:val="CaptionedFigure"/>
+        <w:keepNext/>
+        <w:jc w:val="center"/>
+      </w:pPr>
+      <w:r>
+        <w:drawing>
+          <wp:inline xmlns:a="http://schemas.openxmlformats.org/drawingml/2006/main" xmlns:pic="http://schemas.openxmlformats.org/drawingml/2006/picture">
+            <wp:extent cx="5486400" cy="3429000"/>
+            <wp:docPr id="1928386421" name="Picture 1928386421"/>
+            <wp:cNvGraphicFramePr>
+              <a:graphicFrameLocks noChangeAspect="1"/>
+            </wp:cNvGraphicFramePr>
+            <a:graphic>
+              <a:graphicData uri="http://schemas.openxmlformats.org/drawingml/2006/picture">
+                <pic:pic>
+                  <pic:nvPicPr>
+                    <pic:cNvPr id="0" name="06_outputs.png"/>
+                    <pic:cNvPicPr/>
+                  </pic:nvPicPr>
+                  <pic:blipFill>
+                    <a:blip r:embed="rId19"/>
+                    <a:stretch>
+                      <a:fillRect/>
+                    </a:stretch>
+                  </pic:blipFill>
+                  <pic:spPr>
+                    <a:xfrm>
+                      <a:off x="0" y="0"/>
+                      <a:ext cx="5486400" cy="3429000"/>
+                    </a:xfrm>
+                    <a:prstGeom prst="rect"/>
+                  </pic:spPr>
+                </pic:pic>
+              </a:graphicData>
+            </a:graphic>
+          </wp:inline>
+        </w:drawing>
+      </w:r>
+    </w:p>
+    <w:p>
+      <w:pPr>
+        <w:pStyle w:val="ImageCaption"/>
+        <w:keepLines/>
+        <w:jc w:val="center"/>
+      </w:pPr>
+      <w:r>
+        <w:t>Figure 16. Reviewing outputs: the Status tab shows the run log and confirms which report, diagnostics, map, and comparison files were produced. Produced by the EU SAE Dashboard.</w:t>
+      </w:r>
+    </w:p>
+    <w:p>
+      <w:pPr>
         <w:pStyle w:val="Heading2"/>
       </w:pPr>
       <w:bookmarkStart w:id="242" w:name="ai-assisted-diagnostics"/>
@@ -26744,6 +27050,9 @@
       </w:pPr>
       <w:r>
         <w:t>The core visual outputs are poverty maps by year; CV (uncertainty) maps; change maps, with significance indicated; direct-versus-UFH scatter plots; UFH-versus-MFH scatter plots; residual and Q–Q diagnostic plots; and trend plots for selected areas.</w:t>
+      </w:r>
+      <w:r>
+        <w:t xml:space="preserve"> For app-guidance materials, also include screenshots of the Dashboard launch screen, main workspace, variable mapping, model settings, readiness check, output status, and pipeline flow.</w:t>
       </w:r>
     </w:p>
     <w:p>

</xml_diff>